<commit_message>
test: translate sample document to English
</commit_message>
<xml_diff>
--- a/samples/sample.docx
+++ b/samples/sample.docx
@@ -7,7 +7,7 @@
         <w:pStyle w:val="Title"/>
       </w:pPr>
       <w:r>
-        <w:t>Documento de ejemplo</w:t>
+        <w:t>Sample Document</w:t>
       </w:r>
     </w:p>
     <w:p>
@@ -15,18 +15,18 @@
         <w:pStyle w:val="Heading1"/>
       </w:pPr>
       <w:r>
-        <w:t>1. Formato de texto</w:t>
+        <w:t>1. Text Formatting</w:t>
       </w:r>
     </w:p>
     <w:p>
       <w:r>
-        <w:t xml:space="preserve">Texto normal, </w:t>
+        <w:t xml:space="preserve">Normal text, </w:t>
       </w:r>
       <w:r>
         <w:rPr>
           <w:b/>
         </w:rPr>
-        <w:t>negrita</w:t>
+        <w:t>bold</w:t>
       </w:r>
       <w:r>
         <w:t xml:space="preserve">, </w:t>
@@ -35,7 +35,7 @@
         <w:rPr>
           <w:i/>
         </w:rPr>
-        <w:t>cursiva</w:t>
+        <w:t>italic</w:t>
       </w:r>
       <w:r>
         <w:t xml:space="preserve">, </w:t>
@@ -44,7 +44,7 @@
         <w:rPr>
           <w:u w:val="single"/>
         </w:rPr>
-        <w:t>subrayado</w:t>
+        <w:t>underline</w:t>
       </w:r>
       <w:r>
         <w:t xml:space="preserve">, </w:t>
@@ -53,19 +53,19 @@
         <w:rPr>
           <w:color w:val="C02020"/>
         </w:rPr>
-        <w:t>color rojo</w:t>
+        <w:t>red</w:t>
       </w:r>
       <w:r>
-        <w:t xml:space="preserve"> y tamaño </w:t>
+        <w:t xml:space="preserve"> and size </w:t>
       </w:r>
       <w:r>
         <w:rPr>
           <w:sz w:val="40"/>
         </w:rPr>
-        <w:t>grande</w:t>
+        <w:t>large</w:t>
       </w:r>
       <w:r>
-        <w:t>. Acentos: á é í ó ú ñ ¿? ¡!</w:t>
+        <w:t>. Accents: á é í ó ú ñ ¿? ¡!</w:t>
       </w:r>
     </w:p>
     <w:p>
@@ -73,7 +73,7 @@
         <w:jc w:val="center"/>
       </w:pPr>
       <w:r>
-        <w:t>Párrafo centrado</w:t>
+        <w:t>Centered paragraph</w:t>
       </w:r>
     </w:p>
     <w:p>
@@ -81,7 +81,7 @@
         <w:pStyle w:val="Heading1"/>
       </w:pPr>
       <w:r>
-        <w:t>2. Listas</w:t>
+        <w:t>2. Lists</w:t>
       </w:r>
     </w:p>
     <w:p>
@@ -89,7 +89,7 @@
         <w:pStyle w:val="ListBullet"/>
       </w:pPr>
       <w:r>
-        <w:t>Elemento con viñeta uno</w:t>
+        <w:t>Bullet item one</w:t>
       </w:r>
     </w:p>
     <w:p>
@@ -97,7 +97,7 @@
         <w:pStyle w:val="ListBullet"/>
       </w:pPr>
       <w:r>
-        <w:t>Elemento con viñeta dos</w:t>
+        <w:t>Bullet item two</w:t>
       </w:r>
     </w:p>
     <w:p>
@@ -105,7 +105,7 @@
         <w:pStyle w:val="ListNumber"/>
       </w:pPr>
       <w:r>
-        <w:t>Primer paso numerado</w:t>
+        <w:t>First numbered step</w:t>
       </w:r>
     </w:p>
     <w:p>
@@ -113,7 +113,7 @@
         <w:pStyle w:val="ListNumber"/>
       </w:pPr>
       <w:r>
-        <w:t>Segundo paso numerado</w:t>
+        <w:t>Second numbered step</w:t>
       </w:r>
     </w:p>
     <w:p>
@@ -121,7 +121,7 @@
         <w:pStyle w:val="Heading1"/>
       </w:pPr>
       <w:r>
-        <w:t>3. Tabla</w:t>
+        <w:t>3. Table</w:t>
       </w:r>
     </w:p>
     <w:tbl>
@@ -237,7 +237,7 @@
         <w:pStyle w:val="Heading1"/>
       </w:pPr>
       <w:r>
-        <w:t>4. Imagen</w:t>
+        <w:t>4. Image</w:t>
       </w:r>
     </w:p>
     <w:p>
@@ -278,7 +278,7 @@
     </w:p>
     <w:p>
       <w:r>
-        <w:t xml:space="preserve">Texto largo para probar el ajuste de línea. Texto largo para probar el ajuste de línea. Texto largo para probar el ajuste de línea. Texto largo para probar el ajuste de línea. Texto largo para probar el ajuste de línea. Texto largo para probar el ajuste de línea. Texto largo para probar el ajuste de línea. Texto largo para probar el ajuste de línea. Texto largo para probar el ajuste de línea. Texto largo para probar el ajuste de línea. Texto largo para probar el ajuste de línea. Texto largo para probar el ajuste de línea. </w:t>
+        <w:t xml:space="preserve">Long text to test line wrapping. Long text to test line wrapping. Long text to test line wrapping. Long text to test line wrapping. Long text to test line wrapping. Long text to test line wrapping. Long text to test line wrapping. Long text to test line wrapping. Long text to test line wrapping. Long text to test line wrapping. Long text to test line wrapping. Long text to test line wrapping. </w:t>
       </w:r>
     </w:p>
     <w:sectPr>

</xml_diff>